<commit_message>
Pyae Phyo Maung joins the team
Added to the title page and to the team table in chapter 3, and the head count
in the economic feasibility section corrected from four students to five.

The role column reads "to be confirmed" rather than a guess. The other four
entries come from the roles document, which allocates seven roles across four
people; where a fifth fits is the team's decision and not something to invent in
a report that will be marked.
</commit_message>
<xml_diff>
--- a/docs/report/documents/Orbital-Report-Chapters-1-3.docx
+++ b/docs/report/documents/Orbital-Report-Chapters-1-3.docx
@@ -48,6 +48,14 @@
       </w:pPr>
       <w:r>
         <w:t>Nyan Lin Htet (6708397)</w:t>
+      </w:r>
+    </w:p>
+    <w:p>
+      <w:pPr>
+        <w:pStyle w:val="Author"/>
+      </w:pPr>
+      <w:r>
+        <w:t>Pyae Phyo Maung (6708170)</w:t>
       </w:r>
     </w:p>
     <w:p>
@@ -66,7 +74,7 @@
           <w:sz w:val="24"/>
           <w:szCs w:val="24"/>
         </w:rPr>
-        <w:id w:val="-1350792779"/>
+        <w:id w:val="610403446"/>
         <w:docPartObj>
           <w:docPartGallery w:val="Table of Contents"/>
           <w:docPartUnique/>
@@ -105,7 +113,7 @@
           <w:r>
             <w:fldChar w:fldCharType="separate"/>
           </w:r>
-          <w:hyperlink w:anchor="_Toc239714350" w:history="1">
+          <w:hyperlink w:anchor="_Toc239715772" w:history="1">
             <w:r>
               <w:rPr>
                 <w:rStyle w:val="Hyperlink"/>
@@ -132,7 +140,7 @@
                 <w:noProof/>
                 <w:webHidden/>
               </w:rPr>
-              <w:instrText xml:space="preserve"> PAGEREF _Toc239714350 \h </w:instrText>
+              <w:instrText xml:space="preserve"> PAGEREF _Toc239715772 \h </w:instrText>
             </w:r>
             <w:r>
               <w:rPr>
@@ -177,7 +185,7 @@
               <w14:ligatures w14:val="standardContextual"/>
             </w:rPr>
           </w:pPr>
-          <w:hyperlink w:anchor="_Toc239714351" w:history="1">
+          <w:hyperlink w:anchor="_Toc239715773" w:history="1">
             <w:r>
               <w:rPr>
                 <w:rStyle w:val="Hyperlink"/>
@@ -204,7 +212,7 @@
                 <w:noProof/>
                 <w:webHidden/>
               </w:rPr>
-              <w:instrText xml:space="preserve"> PAGEREF _Toc239714351 \h </w:instrText>
+              <w:instrText xml:space="preserve"> PAGEREF _Toc239715773 \h </w:instrText>
             </w:r>
             <w:r>
               <w:rPr>
@@ -249,7 +257,7 @@
               <w14:ligatures w14:val="standardContextual"/>
             </w:rPr>
           </w:pPr>
-          <w:hyperlink w:anchor="_Toc239714352" w:history="1">
+          <w:hyperlink w:anchor="_Toc239715774" w:history="1">
             <w:r>
               <w:rPr>
                 <w:rStyle w:val="Hyperlink"/>
@@ -276,7 +284,7 @@
                 <w:noProof/>
                 <w:webHidden/>
               </w:rPr>
-              <w:instrText xml:space="preserve"> PAGEREF _Toc239714352 \h </w:instrText>
+              <w:instrText xml:space="preserve"> PAGEREF _Toc239715774 \h </w:instrText>
             </w:r>
             <w:r>
               <w:rPr>
@@ -321,7 +329,7 @@
               <w14:ligatures w14:val="standardContextual"/>
             </w:rPr>
           </w:pPr>
-          <w:hyperlink w:anchor="_Toc239714353" w:history="1">
+          <w:hyperlink w:anchor="_Toc239715775" w:history="1">
             <w:r>
               <w:rPr>
                 <w:rStyle w:val="Hyperlink"/>
@@ -348,7 +356,7 @@
                 <w:noProof/>
                 <w:webHidden/>
               </w:rPr>
-              <w:instrText xml:space="preserve"> PAGEREF _Toc239714353 \h </w:instrText>
+              <w:instrText xml:space="preserve"> PAGEREF _Toc239715775 \h </w:instrText>
             </w:r>
             <w:r>
               <w:rPr>
@@ -393,7 +401,7 @@
               <w14:ligatures w14:val="standardContextual"/>
             </w:rPr>
           </w:pPr>
-          <w:hyperlink w:anchor="_Toc239714354" w:history="1">
+          <w:hyperlink w:anchor="_Toc239715776" w:history="1">
             <w:r>
               <w:rPr>
                 <w:rStyle w:val="Hyperlink"/>
@@ -420,7 +428,7 @@
                 <w:noProof/>
                 <w:webHidden/>
               </w:rPr>
-              <w:instrText xml:space="preserve"> PAGEREF _Toc239714354 \h </w:instrText>
+              <w:instrText xml:space="preserve"> PAGEREF _Toc239715776 \h </w:instrText>
             </w:r>
             <w:r>
               <w:rPr>
@@ -465,7 +473,7 @@
               <w14:ligatures w14:val="standardContextual"/>
             </w:rPr>
           </w:pPr>
-          <w:hyperlink w:anchor="_Toc239714355" w:history="1">
+          <w:hyperlink w:anchor="_Toc239715777" w:history="1">
             <w:r>
               <w:rPr>
                 <w:rStyle w:val="Hyperlink"/>
@@ -492,7 +500,7 @@
                 <w:noProof/>
                 <w:webHidden/>
               </w:rPr>
-              <w:instrText xml:space="preserve"> PAGEREF _Toc239714355 \h </w:instrText>
+              <w:instrText xml:space="preserve"> PAGEREF _Toc239715777 \h </w:instrText>
             </w:r>
             <w:r>
               <w:rPr>
@@ -537,7 +545,7 @@
               <w14:ligatures w14:val="standardContextual"/>
             </w:rPr>
           </w:pPr>
-          <w:hyperlink w:anchor="_Toc239714356" w:history="1">
+          <w:hyperlink w:anchor="_Toc239715778" w:history="1">
             <w:r>
               <w:rPr>
                 <w:rStyle w:val="Hyperlink"/>
@@ -564,7 +572,7 @@
                 <w:noProof/>
                 <w:webHidden/>
               </w:rPr>
-              <w:instrText xml:space="preserve"> PAGEREF _Toc239714356 \h </w:instrText>
+              <w:instrText xml:space="preserve"> PAGEREF _Toc239715778 \h </w:instrText>
             </w:r>
             <w:r>
               <w:rPr>
@@ -609,7 +617,7 @@
               <w14:ligatures w14:val="standardContextual"/>
             </w:rPr>
           </w:pPr>
-          <w:hyperlink w:anchor="_Toc239714357" w:history="1">
+          <w:hyperlink w:anchor="_Toc239715779" w:history="1">
             <w:r>
               <w:rPr>
                 <w:rStyle w:val="Hyperlink"/>
@@ -636,7 +644,7 @@
                 <w:noProof/>
                 <w:webHidden/>
               </w:rPr>
-              <w:instrText xml:space="preserve"> PAGEREF _Toc239714357 \h </w:instrText>
+              <w:instrText xml:space="preserve"> PAGEREF _Toc239715779 \h </w:instrText>
             </w:r>
             <w:r>
               <w:rPr>
@@ -681,7 +689,7 @@
               <w14:ligatures w14:val="standardContextual"/>
             </w:rPr>
           </w:pPr>
-          <w:hyperlink w:anchor="_Toc239714358" w:history="1">
+          <w:hyperlink w:anchor="_Toc239715780" w:history="1">
             <w:r>
               <w:rPr>
                 <w:rStyle w:val="Hyperlink"/>
@@ -708,7 +716,7 @@
                 <w:noProof/>
                 <w:webHidden/>
               </w:rPr>
-              <w:instrText xml:space="preserve"> PAGEREF _Toc239714358 \h </w:instrText>
+              <w:instrText xml:space="preserve"> PAGEREF _Toc239715780 \h </w:instrText>
             </w:r>
             <w:r>
               <w:rPr>
@@ -753,7 +761,7 @@
               <w14:ligatures w14:val="standardContextual"/>
             </w:rPr>
           </w:pPr>
-          <w:hyperlink w:anchor="_Toc239714359" w:history="1">
+          <w:hyperlink w:anchor="_Toc239715781" w:history="1">
             <w:r>
               <w:rPr>
                 <w:rStyle w:val="Hyperlink"/>
@@ -780,7 +788,7 @@
                 <w:noProof/>
                 <w:webHidden/>
               </w:rPr>
-              <w:instrText xml:space="preserve"> PAGEREF _Toc239714359 \h </w:instrText>
+              <w:instrText xml:space="preserve"> PAGEREF _Toc239715781 \h </w:instrText>
             </w:r>
             <w:r>
               <w:rPr>
@@ -825,7 +833,7 @@
               <w14:ligatures w14:val="standardContextual"/>
             </w:rPr>
           </w:pPr>
-          <w:hyperlink w:anchor="_Toc239714360" w:history="1">
+          <w:hyperlink w:anchor="_Toc239715782" w:history="1">
             <w:r>
               <w:rPr>
                 <w:rStyle w:val="Hyperlink"/>
@@ -852,7 +860,7 @@
                 <w:noProof/>
                 <w:webHidden/>
               </w:rPr>
-              <w:instrText xml:space="preserve"> PAGEREF _Toc239714360 \h </w:instrText>
+              <w:instrText xml:space="preserve"> PAGEREF _Toc239715782 \h </w:instrText>
             </w:r>
             <w:r>
               <w:rPr>
@@ -897,7 +905,7 @@
               <w14:ligatures w14:val="standardContextual"/>
             </w:rPr>
           </w:pPr>
-          <w:hyperlink w:anchor="_Toc239714361" w:history="1">
+          <w:hyperlink w:anchor="_Toc239715783" w:history="1">
             <w:r>
               <w:rPr>
                 <w:rStyle w:val="Hyperlink"/>
@@ -924,7 +932,7 @@
                 <w:noProof/>
                 <w:webHidden/>
               </w:rPr>
-              <w:instrText xml:space="preserve"> PAGEREF _Toc239714361 \h </w:instrText>
+              <w:instrText xml:space="preserve"> PAGEREF _Toc239715783 \h </w:instrText>
             </w:r>
             <w:r>
               <w:rPr>
@@ -969,7 +977,7 @@
               <w14:ligatures w14:val="standardContextual"/>
             </w:rPr>
           </w:pPr>
-          <w:hyperlink w:anchor="_Toc239714362" w:history="1">
+          <w:hyperlink w:anchor="_Toc239715784" w:history="1">
             <w:r>
               <w:rPr>
                 <w:rStyle w:val="Hyperlink"/>
@@ -996,7 +1004,7 @@
                 <w:noProof/>
                 <w:webHidden/>
               </w:rPr>
-              <w:instrText xml:space="preserve"> PAGEREF _Toc239714362 \h </w:instrText>
+              <w:instrText xml:space="preserve"> PAGEREF _Toc239715784 \h </w:instrText>
             </w:r>
             <w:r>
               <w:rPr>
@@ -1041,7 +1049,7 @@
               <w14:ligatures w14:val="standardContextual"/>
             </w:rPr>
           </w:pPr>
-          <w:hyperlink w:anchor="_Toc239714363" w:history="1">
+          <w:hyperlink w:anchor="_Toc239715785" w:history="1">
             <w:r>
               <w:rPr>
                 <w:rStyle w:val="Hyperlink"/>
@@ -1068,7 +1076,7 @@
                 <w:noProof/>
                 <w:webHidden/>
               </w:rPr>
-              <w:instrText xml:space="preserve"> PAGEREF _Toc239714363 \h </w:instrText>
+              <w:instrText xml:space="preserve"> PAGEREF _Toc239715785 \h </w:instrText>
             </w:r>
             <w:r>
               <w:rPr>
@@ -1113,7 +1121,7 @@
               <w14:ligatures w14:val="standardContextual"/>
             </w:rPr>
           </w:pPr>
-          <w:hyperlink w:anchor="_Toc239714364" w:history="1">
+          <w:hyperlink w:anchor="_Toc239715786" w:history="1">
             <w:r>
               <w:rPr>
                 <w:rStyle w:val="Hyperlink"/>
@@ -1140,7 +1148,7 @@
                 <w:noProof/>
                 <w:webHidden/>
               </w:rPr>
-              <w:instrText xml:space="preserve"> PAGEREF _Toc239714364 \h </w:instrText>
+              <w:instrText xml:space="preserve"> PAGEREF _Toc239715786 \h </w:instrText>
             </w:r>
             <w:r>
               <w:rPr>
@@ -1185,7 +1193,7 @@
               <w14:ligatures w14:val="standardContextual"/>
             </w:rPr>
           </w:pPr>
-          <w:hyperlink w:anchor="_Toc239714365" w:history="1">
+          <w:hyperlink w:anchor="_Toc239715787" w:history="1">
             <w:r>
               <w:rPr>
                 <w:rStyle w:val="Hyperlink"/>
@@ -1212,7 +1220,7 @@
                 <w:noProof/>
                 <w:webHidden/>
               </w:rPr>
-              <w:instrText xml:space="preserve"> PAGEREF _Toc239714365 \h </w:instrText>
+              <w:instrText xml:space="preserve"> PAGEREF _Toc239715787 \h </w:instrText>
             </w:r>
             <w:r>
               <w:rPr>
@@ -1257,7 +1265,7 @@
               <w14:ligatures w14:val="standardContextual"/>
             </w:rPr>
           </w:pPr>
-          <w:hyperlink w:anchor="_Toc239714366" w:history="1">
+          <w:hyperlink w:anchor="_Toc239715788" w:history="1">
             <w:r>
               <w:rPr>
                 <w:rStyle w:val="Hyperlink"/>
@@ -1284,7 +1292,7 @@
                 <w:noProof/>
                 <w:webHidden/>
               </w:rPr>
-              <w:instrText xml:space="preserve"> PAGEREF _Toc239714366 \h </w:instrText>
+              <w:instrText xml:space="preserve"> PAGEREF _Toc239715788 \h </w:instrText>
             </w:r>
             <w:r>
               <w:rPr>
@@ -1329,7 +1337,7 @@
               <w14:ligatures w14:val="standardContextual"/>
             </w:rPr>
           </w:pPr>
-          <w:hyperlink w:anchor="_Toc239714367" w:history="1">
+          <w:hyperlink w:anchor="_Toc239715789" w:history="1">
             <w:r>
               <w:rPr>
                 <w:rStyle w:val="Hyperlink"/>
@@ -1356,7 +1364,7 @@
                 <w:noProof/>
                 <w:webHidden/>
               </w:rPr>
-              <w:instrText xml:space="preserve"> PAGEREF _Toc239714367 \h </w:instrText>
+              <w:instrText xml:space="preserve"> PAGEREF _Toc239715789 \h </w:instrText>
             </w:r>
             <w:r>
               <w:rPr>
@@ -1401,7 +1409,7 @@
               <w14:ligatures w14:val="standardContextual"/>
             </w:rPr>
           </w:pPr>
-          <w:hyperlink w:anchor="_Toc239714368" w:history="1">
+          <w:hyperlink w:anchor="_Toc239715790" w:history="1">
             <w:r>
               <w:rPr>
                 <w:rStyle w:val="Hyperlink"/>
@@ -1428,7 +1436,7 @@
                 <w:noProof/>
                 <w:webHidden/>
               </w:rPr>
-              <w:instrText xml:space="preserve"> PAGEREF _Toc239714368 \h </w:instrText>
+              <w:instrText xml:space="preserve"> PAGEREF _Toc239715790 \h </w:instrText>
             </w:r>
             <w:r>
               <w:rPr>
@@ -1473,7 +1481,7 @@
               <w14:ligatures w14:val="standardContextual"/>
             </w:rPr>
           </w:pPr>
-          <w:hyperlink w:anchor="_Toc239714369" w:history="1">
+          <w:hyperlink w:anchor="_Toc239715791" w:history="1">
             <w:r>
               <w:rPr>
                 <w:rStyle w:val="Hyperlink"/>
@@ -1500,7 +1508,7 @@
                 <w:noProof/>
                 <w:webHidden/>
               </w:rPr>
-              <w:instrText xml:space="preserve"> PAGEREF _Toc239714369 \h </w:instrText>
+              <w:instrText xml:space="preserve"> PAGEREF _Toc239715791 \h </w:instrText>
             </w:r>
             <w:r>
               <w:rPr>
@@ -1545,7 +1553,7 @@
               <w14:ligatures w14:val="standardContextual"/>
             </w:rPr>
           </w:pPr>
-          <w:hyperlink w:anchor="_Toc239714370" w:history="1">
+          <w:hyperlink w:anchor="_Toc239715792" w:history="1">
             <w:r>
               <w:rPr>
                 <w:rStyle w:val="Hyperlink"/>
@@ -1572,7 +1580,7 @@
                 <w:noProof/>
                 <w:webHidden/>
               </w:rPr>
-              <w:instrText xml:space="preserve"> PAGEREF _Toc239714370 \h </w:instrText>
+              <w:instrText xml:space="preserve"> PAGEREF _Toc239715792 \h </w:instrText>
             </w:r>
             <w:r>
               <w:rPr>
@@ -1615,7 +1623,7 @@
         <w:pStyle w:val="Heading1"/>
       </w:pPr>
       <w:bookmarkStart w:id="0" w:name="chapter-1-introduction"/>
-      <w:bookmarkStart w:id="1" w:name="_Toc239714350"/>
+      <w:bookmarkStart w:id="1" w:name="_Toc239715772"/>
       <w:r>
         <w:t>Chapter 1: Introduction</w:t>
       </w:r>
@@ -1626,7 +1634,7 @@
         <w:pStyle w:val="Heading2"/>
       </w:pPr>
       <w:bookmarkStart w:id="2" w:name="background-and-problem-statement"/>
-      <w:bookmarkStart w:id="3" w:name="_Toc239714351"/>
+      <w:bookmarkStart w:id="3" w:name="_Toc239715773"/>
       <w:r>
         <w:t>1.1 Background and Problem Statement</w:t>
       </w:r>
@@ -1734,7 +1742,7 @@
         <w:pStyle w:val="Heading2"/>
       </w:pPr>
       <w:bookmarkStart w:id="4" w:name="project-objectives"/>
-      <w:bookmarkStart w:id="5" w:name="_Toc239714352"/>
+      <w:bookmarkStart w:id="5" w:name="_Toc239715774"/>
       <w:bookmarkEnd w:id="2"/>
       <w:r>
         <w:t>1.2 Project Objectives</w:t>
@@ -1985,7 +1993,7 @@
         <w:pStyle w:val="Heading2"/>
       </w:pPr>
       <w:bookmarkStart w:id="6" w:name="project-scope"/>
-      <w:bookmarkStart w:id="7" w:name="_Toc239714353"/>
+      <w:bookmarkStart w:id="7" w:name="_Toc239715775"/>
       <w:bookmarkEnd w:id="4"/>
       <w:r>
         <w:t>1.3 Project Scope</w:t>
@@ -2408,7 +2416,7 @@
         <w:pStyle w:val="Heading2"/>
       </w:pPr>
       <w:bookmarkStart w:id="10" w:name="expected-benefits"/>
-      <w:bookmarkStart w:id="11" w:name="_Toc239714354"/>
+      <w:bookmarkStart w:id="11" w:name="_Toc239715776"/>
       <w:bookmarkEnd w:id="6"/>
       <w:bookmarkEnd w:id="9"/>
       <w:r>
@@ -2472,7 +2480,7 @@
         <w:pStyle w:val="Heading2"/>
       </w:pPr>
       <w:bookmarkStart w:id="12" w:name="tools-and-technologies-used"/>
-      <w:bookmarkStart w:id="13" w:name="_Toc239714355"/>
+      <w:bookmarkStart w:id="13" w:name="_Toc239715777"/>
       <w:bookmarkEnd w:id="10"/>
       <w:r>
         <w:t>1.5 Tools and Technologies Used</w:t>
@@ -3220,7 +3228,7 @@
         <w:pStyle w:val="Heading2"/>
       </w:pPr>
       <w:bookmarkStart w:id="15" w:name="scale-of-the-system"/>
-      <w:bookmarkStart w:id="16" w:name="_Toc239714356"/>
+      <w:bookmarkStart w:id="16" w:name="_Toc239715778"/>
       <w:bookmarkEnd w:id="12"/>
       <w:bookmarkEnd w:id="14"/>
       <w:r>
@@ -3448,7 +3456,7 @@
         <w:pStyle w:val="Heading1"/>
       </w:pPr>
       <w:bookmarkStart w:id="17" w:name="Xc05cc228f2b7de398dc6782bbdd9db7651af371"/>
-      <w:bookmarkStart w:id="18" w:name="_Toc239714357"/>
+      <w:bookmarkStart w:id="18" w:name="_Toc239715779"/>
       <w:bookmarkEnd w:id="0"/>
       <w:bookmarkEnd w:id="15"/>
       <w:r>
@@ -3461,7 +3469,7 @@
         <w:pStyle w:val="Heading2"/>
       </w:pPr>
       <w:bookmarkStart w:id="19" w:name="technical-feasibility"/>
-      <w:bookmarkStart w:id="20" w:name="_Toc239714358"/>
+      <w:bookmarkStart w:id="20" w:name="_Toc239715780"/>
       <w:r>
         <w:t>2.1 Technical Feasibility</w:t>
       </w:r>
@@ -4002,7 +4010,7 @@
         <w:pStyle w:val="Heading2"/>
       </w:pPr>
       <w:bookmarkStart w:id="23" w:name="economic-feasibility"/>
-      <w:bookmarkStart w:id="24" w:name="_Toc239714359"/>
+      <w:bookmarkStart w:id="24" w:name="_Toc239715781"/>
       <w:bookmarkEnd w:id="19"/>
       <w:bookmarkEnd w:id="22"/>
       <w:r>
@@ -4206,7 +4214,7 @@
         <w:pStyle w:val="BodyText"/>
       </w:pPr>
       <w:r>
-        <w:t>The real cost is labour: four students over one semester.</w:t>
+        <w:t>The real cost is labour: five students over one semester.</w:t>
       </w:r>
     </w:p>
     <w:p>
@@ -4436,7 +4444,7 @@
         <w:pStyle w:val="Heading2"/>
       </w:pPr>
       <w:bookmarkStart w:id="29" w:name="operational-feasibility"/>
-      <w:bookmarkStart w:id="30" w:name="_Toc239714360"/>
+      <w:bookmarkStart w:id="30" w:name="_Toc239715782"/>
       <w:bookmarkEnd w:id="23"/>
       <w:bookmarkEnd w:id="28"/>
       <w:r>
@@ -4687,7 +4695,7 @@
         <w:pStyle w:val="Heading2"/>
       </w:pPr>
       <w:bookmarkStart w:id="34" w:name="schedule-feasibility"/>
-      <w:bookmarkStart w:id="35" w:name="_Toc239714361"/>
+      <w:bookmarkStart w:id="35" w:name="_Toc239715783"/>
       <w:bookmarkEnd w:id="29"/>
       <w:bookmarkEnd w:id="33"/>
       <w:r>
@@ -4937,7 +4945,7 @@
         <w:pStyle w:val="Heading2"/>
       </w:pPr>
       <w:bookmarkStart w:id="36" w:name="related-systems"/>
-      <w:bookmarkStart w:id="37" w:name="_Toc239714362"/>
+      <w:bookmarkStart w:id="37" w:name="_Toc239715784"/>
       <w:bookmarkEnd w:id="34"/>
       <w:r>
         <w:t>2.5 Related Systems</w:t>
@@ -5359,7 +5367,7 @@
         <w:pStyle w:val="Heading2"/>
       </w:pPr>
       <w:bookmarkStart w:id="38" w:name="relevant-theories-and-technologies"/>
-      <w:bookmarkStart w:id="39" w:name="_Toc239714363"/>
+      <w:bookmarkStart w:id="39" w:name="_Toc239715785"/>
       <w:bookmarkEnd w:id="36"/>
       <w:r>
         <w:t>2.6 Relevant Theories and Technologies</w:t>
@@ -5478,7 +5486,7 @@
         <w:pStyle w:val="Heading1"/>
       </w:pPr>
       <w:bookmarkStart w:id="40" w:name="chapter-3-requirements-analysis"/>
-      <w:bookmarkStart w:id="41" w:name="_Toc239714364"/>
+      <w:bookmarkStart w:id="41" w:name="_Toc239715786"/>
       <w:bookmarkEnd w:id="17"/>
       <w:bookmarkEnd w:id="38"/>
       <w:r>
@@ -5491,7 +5499,7 @@
         <w:pStyle w:val="Heading2"/>
       </w:pPr>
       <w:bookmarkStart w:id="42" w:name="stakeholder-analysis"/>
-      <w:bookmarkStart w:id="43" w:name="_Toc239714365"/>
+      <w:bookmarkStart w:id="43" w:name="_Toc239715787"/>
       <w:r>
         <w:t>3.1 Stakeholder Analysis</w:t>
       </w:r>
@@ -6386,13 +6394,54 @@
           </w:p>
         </w:tc>
       </w:tr>
+      <w:tr>
+        <w:tc>
+          <w:tcPr>
+            <w:tcW w:w="0" w:type="auto"/>
+          </w:tcPr>
+          <w:p>
+            <w:pPr>
+              <w:pStyle w:val="Compact"/>
+            </w:pPr>
+            <w:r>
+              <w:t>Pyae Phyo Maung</w:t>
+            </w:r>
+          </w:p>
+        </w:tc>
+        <w:tc>
+          <w:tcPr>
+            <w:tcW w:w="0" w:type="auto"/>
+          </w:tcPr>
+          <w:p>
+            <w:pPr>
+              <w:pStyle w:val="Compact"/>
+            </w:pPr>
+            <w:r>
+              <w:t>6708170</w:t>
+            </w:r>
+          </w:p>
+        </w:tc>
+        <w:tc>
+          <w:tcPr>
+            <w:tcW w:w="0" w:type="auto"/>
+          </w:tcPr>
+          <w:p>
+            <w:pPr>
+              <w:pStyle w:val="Compact"/>
+            </w:pPr>
+            <w:r>
+              <w:t>To be confirmed</w:t>
+            </w:r>
+          </w:p>
+        </w:tc>
+      </w:tr>
     </w:tbl>
     <w:p>
       <w:pPr>
         <w:pStyle w:val="Heading2"/>
       </w:pPr>
       <w:bookmarkStart w:id="47" w:name="functional-requirements"/>
-      <w:bookmarkStart w:id="48" w:name="_Toc239714366"/>
+      <w:bookmarkStart w:id="48" w:name="_Toc239715788"/>
       <w:bookmarkEnd w:id="42"/>
       <w:bookmarkEnd w:id="46"/>
       <w:r>
@@ -8406,7 +8455,7 @@
         <w:pStyle w:val="Heading2"/>
       </w:pPr>
       <w:bookmarkStart w:id="53" w:name="non-functional-requirements"/>
-      <w:bookmarkStart w:id="54" w:name="_Toc239714367"/>
+      <w:bookmarkStart w:id="54" w:name="_Toc239715789"/>
       <w:bookmarkEnd w:id="47"/>
       <w:bookmarkEnd w:id="52"/>
       <w:r>
@@ -9948,7 +9997,7 @@
         <w:pStyle w:val="Heading2"/>
       </w:pPr>
       <w:bookmarkStart w:id="61" w:name="use-case-diagram"/>
-      <w:bookmarkStart w:id="62" w:name="_Toc239714368"/>
+      <w:bookmarkStart w:id="62" w:name="_Toc239715790"/>
       <w:bookmarkEnd w:id="53"/>
       <w:bookmarkEnd w:id="60"/>
       <w:r>
@@ -10253,7 +10302,7 @@
         <w:pStyle w:val="Heading2"/>
       </w:pPr>
       <w:bookmarkStart w:id="63" w:name="use-case-descriptions"/>
-      <w:bookmarkStart w:id="64" w:name="_Toc239714369"/>
+      <w:bookmarkStart w:id="64" w:name="_Toc239715791"/>
       <w:bookmarkEnd w:id="61"/>
       <w:r>
         <w:t>3.5 Use Case Descriptions</w:t>
@@ -10366,7 +10415,10 @@
         <w:t>A1</w:t>
       </w:r>
       <w:r>
-        <w:t xml:space="preserve"> Data is stale: the response is flagged, markers past two minutes fade. </w:t>
+        <w:t xml:space="preserve"> </w:t>
+      </w:r>
+      <w:r>
+        <w:t xml:space="preserve">Data is stale: the response is flagged, markers past two minutes fade. </w:t>
       </w:r>
       <w:r>
         <w:rPr>
@@ -10376,10 +10428,7 @@
         <w:t>A2</w:t>
       </w:r>
       <w:r>
-        <w:t xml:space="preserve"> </w:t>
-      </w:r>
-      <w:r>
-        <w:t xml:space="preserve">Backend unreachable: the last state remains; the map is not cleared. </w:t>
+        <w:t xml:space="preserve"> Backend unreachable: the last state remains; the map is not cleared. </w:t>
       </w:r>
       <w:r>
         <w:rPr>
@@ -10932,10 +10981,7 @@
         </w:numPr>
       </w:pPr>
       <w:r>
-        <w:t xml:space="preserve">The provider fetches and converts to the shared shape, discarding objects </w:t>
-      </w:r>
-      <w:r>
-        <w:t>without a usable position and converting every “not available” encoding to an explicit absence.</w:t>
+        <w:t>The provider fetches and converts to the shared shape, discarding objects without a usable position and converting every “not available” encoding to an explicit absence.</w:t>
       </w:r>
     </w:p>
     <w:p>
@@ -11089,7 +11135,10 @@
         </w:numPr>
       </w:pPr>
       <w:r>
-        <w:t>Positions older than fifteen minutes are removed; identities are kept for six hours, because a vessel’s name does not expire when its position does.</w:t>
+        <w:t xml:space="preserve">Positions older than fifteen minutes are removed; identities are kept for six </w:t>
+      </w:r>
+      <w:r>
+        <w:t>hours, because a vessel’s name does not expire when its position does.</w:t>
       </w:r>
     </w:p>
     <w:p>
@@ -11104,10 +11153,7 @@
         <w:t>A1</w:t>
       </w:r>
       <w:r>
-        <w:t xml:space="preserve"> Connection dropped: reconnection with backoff, losing nothing, because </w:t>
-      </w:r>
-      <w:r>
-        <w:t>the accumulated world is held locally.</w:t>
+        <w:t xml:space="preserve"> Connection dropped: reconnection with backoff, losing nothing, because the accumulated world is held locally.</w:t>
       </w:r>
     </w:p>
     <w:p>
@@ -11172,7 +11218,7 @@
         <w:pStyle w:val="Heading2"/>
       </w:pPr>
       <w:bookmarkStart w:id="75" w:name="software-requirements-specification"/>
-      <w:bookmarkStart w:id="76" w:name="_Toc239714370"/>
+      <w:bookmarkStart w:id="76" w:name="_Toc239715792"/>
       <w:bookmarkEnd w:id="63"/>
       <w:bookmarkEnd w:id="74"/>
       <w:r>
@@ -11194,10 +11240,7 @@
         <w:pStyle w:val="FirstParagraph"/>
       </w:pPr>
       <w:r>
-        <w:t xml:space="preserve">This specification covers Orbital, a web application presenting live aircraft, ship and satellite positions on an interactive Earth. It defines the external </w:t>
-      </w:r>
-      <w:r>
-        <w:t>interfaces, the shared data contract and the operating constraints.</w:t>
+        <w:t>This specification covers Orbital, a web application presenting live aircraft, ship and satellite positions on an interactive Earth. It defines the external interfaces, the shared data contract and the operating constraints.</w:t>
       </w:r>
     </w:p>
     <w:p>
@@ -11244,7 +11287,10 @@
         <w:pStyle w:val="FirstParagraph"/>
       </w:pPr>
       <w:r>
-        <w:t>Data flows in one direction, and each layer knows only the layer beneath it. Three properties follow:</w:t>
+        <w:t>Data flows in one direction, and each layer knows only the layer beneath it.</w:t>
+      </w:r>
+      <w:r>
+        <w:t xml:space="preserve"> Three properties follow:</w:t>
       </w:r>
     </w:p>
     <w:p>
@@ -13065,10 +13111,7 @@
         <w:pStyle w:val="BodyText"/>
       </w:pPr>
       <w:r>
-        <w:t xml:space="preserve">Eighteen defects are recorded as having been invisible to the tests at the time </w:t>
-      </w:r>
-      <w:r>
-        <w:t>they existed, each found by running the application and looking at it. In every case the code was correct and the wiring was absent or mismatched. Unit tests verify code; only running the system verifies wiring.</w:t>
+        <w:t>Eighteen defects are recorded as having been invisible to the tests at the time they existed, each found by running the application and looking at it. In every case the code was correct and the wiring was absent or mismatched. Unit tests verify code; only running the system verifies wiring.</w:t>
       </w:r>
       <w:bookmarkEnd w:id="40"/>
       <w:bookmarkEnd w:id="75"/>
@@ -13132,7 +13175,7 @@
   <w:abstractNum w:abstractNumId="0" w15:restartNumberingAfterBreak="0">
     <w:nsid w:val="EA454B4C"/>
     <w:multiLevelType w:val="multilevel"/>
-    <w:tmpl w:val="AAF2A284"/>
+    <w:tmpl w:val="F7C86B62"/>
     <w:lvl w:ilvl="0">
       <w:start w:val="1"/>
       <w:numFmt w:val="decimal"/>
@@ -13218,7 +13261,7 @@
   <w:abstractNum w:abstractNumId="1" w15:restartNumberingAfterBreak="0">
     <w:nsid w:val="2C1AE401"/>
     <w:multiLevelType w:val="multilevel"/>
-    <w:tmpl w:val="429A610C"/>
+    <w:tmpl w:val="D30E6CBA"/>
     <w:lvl w:ilvl="0">
       <w:numFmt w:val="bullet"/>
       <w:lvlText w:val=" "/>
@@ -13292,10 +13335,10 @@
       </w:pPr>
     </w:lvl>
   </w:abstractNum>
-  <w:num w:numId="1" w16cid:durableId="2041855502">
+  <w:num w:numId="1" w16cid:durableId="519898479">
     <w:abstractNumId w:val="1"/>
   </w:num>
-  <w:num w:numId="2" w16cid:durableId="1519806041">
+  <w:num w:numId="2" w16cid:durableId="1117914409">
     <w:abstractNumId w:val="0"/>
     <w:lvlOverride w:ilvl="0">
       <w:startOverride w:val="1"/>
@@ -13325,7 +13368,7 @@
       <w:startOverride w:val="1"/>
     </w:lvlOverride>
   </w:num>
-  <w:num w:numId="3" w16cid:durableId="313529690">
+  <w:num w:numId="3" w16cid:durableId="1664698085">
     <w:abstractNumId w:val="0"/>
     <w:lvlOverride w:ilvl="0">
       <w:startOverride w:val="1"/>
@@ -13355,7 +13398,7 @@
       <w:startOverride w:val="1"/>
     </w:lvlOverride>
   </w:num>
-  <w:num w:numId="4" w16cid:durableId="890191774">
+  <w:num w:numId="4" w16cid:durableId="498548101">
     <w:abstractNumId w:val="0"/>
     <w:lvlOverride w:ilvl="0">
       <w:startOverride w:val="1"/>
@@ -13385,7 +13428,7 @@
       <w:startOverride w:val="1"/>
     </w:lvlOverride>
   </w:num>
-  <w:num w:numId="5" w16cid:durableId="189884101">
+  <w:num w:numId="5" w16cid:durableId="1985239311">
     <w:abstractNumId w:val="0"/>
     <w:lvlOverride w:ilvl="0">
       <w:startOverride w:val="1"/>
@@ -13415,7 +13458,7 @@
       <w:startOverride w:val="1"/>
     </w:lvlOverride>
   </w:num>
-  <w:num w:numId="6" w16cid:durableId="2001419802">
+  <w:num w:numId="6" w16cid:durableId="1320424631">
     <w:abstractNumId w:val="0"/>
     <w:lvlOverride w:ilvl="0">
       <w:startOverride w:val="1"/>
@@ -13445,7 +13488,7 @@
       <w:startOverride w:val="1"/>
     </w:lvlOverride>
   </w:num>
-  <w:num w:numId="7" w16cid:durableId="1925142991">
+  <w:num w:numId="7" w16cid:durableId="749694856">
     <w:abstractNumId w:val="0"/>
     <w:lvlOverride w:ilvl="0">
       <w:startOverride w:val="1"/>
@@ -13475,7 +13518,7 @@
       <w:startOverride w:val="1"/>
     </w:lvlOverride>
   </w:num>
-  <w:num w:numId="8" w16cid:durableId="95178419">
+  <w:num w:numId="8" w16cid:durableId="318271003">
     <w:abstractNumId w:val="0"/>
     <w:lvlOverride w:ilvl="0">
       <w:startOverride w:val="1"/>
@@ -13505,7 +13548,7 @@
       <w:startOverride w:val="1"/>
     </w:lvlOverride>
   </w:num>
-  <w:num w:numId="9" w16cid:durableId="143938605">
+  <w:num w:numId="9" w16cid:durableId="1692218155">
     <w:abstractNumId w:val="0"/>
     <w:lvlOverride w:ilvl="0">
       <w:startOverride w:val="1"/>
@@ -13535,7 +13578,7 @@
       <w:startOverride w:val="1"/>
     </w:lvlOverride>
   </w:num>
-  <w:num w:numId="10" w16cid:durableId="1039743863">
+  <w:num w:numId="10" w16cid:durableId="1190872216">
     <w:abstractNumId w:val="0"/>
     <w:lvlOverride w:ilvl="0">
       <w:startOverride w:val="1"/>
@@ -13565,7 +13608,7 @@
       <w:startOverride w:val="1"/>
     </w:lvlOverride>
   </w:num>
-  <w:num w:numId="11" w16cid:durableId="766120026">
+  <w:num w:numId="11" w16cid:durableId="545488066">
     <w:abstractNumId w:val="0"/>
     <w:lvlOverride w:ilvl="0">
       <w:startOverride w:val="1"/>
@@ -13595,7 +13638,7 @@
       <w:startOverride w:val="1"/>
     </w:lvlOverride>
   </w:num>
-  <w:num w:numId="12" w16cid:durableId="632103893">
+  <w:num w:numId="12" w16cid:durableId="2086150338">
     <w:abstractNumId w:val="0"/>
     <w:lvlOverride w:ilvl="0">
       <w:startOverride w:val="1"/>
@@ -14641,7 +14684,7 @@
     <w:next w:val="Normal"/>
     <w:autoRedefine/>
     <w:uiPriority w:val="39"/>
-    <w:rsid w:val="001729AC"/>
+    <w:rsid w:val="0098469C"/>
     <w:pPr>
       <w:spacing w:after="100"/>
     </w:pPr>
@@ -14652,7 +14695,7 @@
     <w:next w:val="Normal"/>
     <w:autoRedefine/>
     <w:uiPriority w:val="39"/>
-    <w:rsid w:val="001729AC"/>
+    <w:rsid w:val="0098469C"/>
     <w:pPr>
       <w:spacing w:after="100"/>
       <w:ind w:left="240"/>

</xml_diff>